<commit_message>
zuletzt geändert am, geändert.
</commit_message>
<xml_diff>
--- a/7_KI-Basismodule/KI-B1/KI-B1.2._SekI_EigenschaftenUndDefinitionVonKI.docx
+++ b/7_KI-Basismodule/KI-B1/KI-B1.2._SekI_EigenschaftenUndDefinitionVonKI.docx
@@ -594,30 +594,14 @@
           <w:sz w:val="20"/>
           <w:szCs w:val="20"/>
         </w:rPr>
-        <w:t xml:space="preserve"> entsprechende Entscheidungen als Ergebnis </w:t>
-      </w:r>
-      <w:proofErr w:type="gramStart"/>
-      <w:r>
-        <w:rPr>
-          <w:sz w:val="20"/>
-          <w:szCs w:val="20"/>
-        </w:rPr>
-        <w:t>aus,</w:t>
+        <w:t xml:space="preserve"> entsprechende Entscheidungen als Ergebnis aus,</w:t>
       </w:r>
       <w:r>
         <w:rPr>
           <w:sz w:val="20"/>
           <w:szCs w:val="20"/>
         </w:rPr>
-        <w:t>.</w:t>
-      </w:r>
-      <w:proofErr w:type="gramEnd"/>
-      <w:r>
-        <w:rPr>
-          <w:sz w:val="20"/>
-          <w:szCs w:val="20"/>
-        </w:rPr>
-        <w:t xml:space="preserve"> Solche Algorithmen können auf simple „Wenn ... dann ...“ Strukturen </w:t>
+        <w:t xml:space="preserve">. Solche Algorithmen können auf simple „Wenn ... dann ...“ Strukturen </w:t>
       </w:r>
       <w:r>
         <w:rPr>
@@ -1287,8 +1271,12 @@
           <w:rFonts w:eastAsia="Helvetica 45" w:cs="Helvetica 45"/>
         </w:rPr>
         <w:sectPr>
-          <w:headerReference w:type="default" r:id="rId10"/>
-          <w:footerReference w:type="default" r:id="rId11"/>
+          <w:headerReference w:type="even" r:id="rId10"/>
+          <w:headerReference w:type="default" r:id="rId11"/>
+          <w:footerReference w:type="even" r:id="rId12"/>
+          <w:footerReference w:type="default" r:id="rId13"/>
+          <w:headerReference w:type="first" r:id="rId14"/>
+          <w:footerReference w:type="first" r:id="rId15"/>
           <w:pgSz w:w="11906" w:h="16838"/>
           <w:pgMar w:top="1134" w:right="1531" w:bottom="1276" w:left="1531" w:header="425" w:footer="284" w:gutter="0"/>
           <w:cols w:space="708"/>
@@ -1314,19 +1302,6 @@
         <w:gridCol w:w="1418"/>
         <w:gridCol w:w="1275"/>
         <w:gridCol w:w="1560"/>
-        <w:tblGridChange w:id="0">
-          <w:tblGrid>
-            <w:gridCol w:w="2122"/>
-            <w:gridCol w:w="1984"/>
-            <w:gridCol w:w="1418"/>
-            <w:gridCol w:w="1559"/>
-            <w:gridCol w:w="1417"/>
-            <w:gridCol w:w="1843"/>
-            <w:gridCol w:w="1418"/>
-            <w:gridCol w:w="1275"/>
-            <w:gridCol w:w="1560"/>
-          </w:tblGrid>
-        </w:tblGridChange>
       </w:tblGrid>
       <w:tr>
         <w:trPr>
@@ -1993,7 +1968,7 @@
                           <pic:cNvPicPr/>
                         </pic:nvPicPr>
                         <pic:blipFill>
-                          <a:blip r:embed="rId12" cstate="print">
+                          <a:blip r:embed="rId16" cstate="print">
                             <a:extLst>
                               <a:ext uri="{28A0092B-C50C-407E-A947-70E740481C1C}">
                                 <a14:useLocalDpi xmlns:a14="http://schemas.microsoft.com/office/drawing/2010/main"/>
@@ -2280,7 +2255,7 @@
                           <pic:cNvPicPr/>
                         </pic:nvPicPr>
                         <pic:blipFill>
-                          <a:blip r:embed="rId13" cstate="print">
+                          <a:blip r:embed="rId17" cstate="print">
                             <a:extLst>
                               <a:ext uri="{28A0092B-C50C-407E-A947-70E740481C1C}">
                                 <a14:useLocalDpi xmlns:a14="http://schemas.microsoft.com/office/drawing/2010/main"/>
@@ -2592,7 +2567,7 @@
                           </pic:cNvPicPr>
                         </pic:nvPicPr>
                         <pic:blipFill rotWithShape="1">
-                          <a:blip r:embed="rId14">
+                          <a:blip r:embed="rId18">
                             <a:extLst>
                               <a:ext uri="{28A0092B-C50C-407E-A947-70E740481C1C}">
                                 <a14:useLocalDpi xmlns:a14="http://schemas.microsoft.com/office/drawing/2010/main"/>
@@ -2678,7 +2653,6 @@
               </w:rPr>
               <w:t xml:space="preserve">Shuttle-Bus, der Schulkinder an Haltestellen aufnimmt und die Fahrt autonom unternimmt, ohne dass eine Busfahrerin oder ein Busfahrer das Fahrzeug </w:t>
             </w:r>
-            <w:proofErr w:type="gramStart"/>
             <w:r>
               <w:rPr>
                 <w:rFonts w:asciiTheme="minorHAnsi" w:eastAsia="Helvetica 45" w:hAnsiTheme="minorHAnsi" w:cstheme="minorHAnsi"/>
@@ -2687,7 +2661,6 @@
               </w:rPr>
               <w:t>steuert</w:t>
             </w:r>
-            <w:proofErr w:type="gramEnd"/>
           </w:p>
         </w:tc>
         <w:tc>
@@ -2893,25 +2866,7 @@
                 <w:sz w:val="18"/>
                 <w:szCs w:val="18"/>
               </w:rPr>
-              <w:t xml:space="preserve">nächste Positionen, Gas- und Bremspedalstellung, Lenkwinkel, </w:t>
-            </w:r>
-            <w:proofErr w:type="spellStart"/>
-            <w:r>
-              <w:rPr>
-                <w:rFonts w:asciiTheme="minorHAnsi" w:eastAsia="Helvetica 45" w:hAnsiTheme="minorHAnsi" w:cstheme="minorHAnsi"/>
-                <w:sz w:val="18"/>
-                <w:szCs w:val="18"/>
-              </w:rPr>
-              <w:t>Blinkerstatus</w:t>
-            </w:r>
-            <w:proofErr w:type="spellEnd"/>
-            <w:r>
-              <w:rPr>
-                <w:rFonts w:asciiTheme="minorHAnsi" w:eastAsia="Helvetica 45" w:hAnsiTheme="minorHAnsi" w:cstheme="minorHAnsi"/>
-                <w:sz w:val="18"/>
-                <w:szCs w:val="18"/>
-              </w:rPr>
-              <w:t xml:space="preserve"> (an/aus),  </w:t>
+              <w:t xml:space="preserve">nächste Positionen, Gas- und Bremspedalstellung, Lenkwinkel, Blinkerstatus (an/aus),  </w:t>
             </w:r>
           </w:p>
         </w:tc>
@@ -3197,8 +3152,8 @@
     <w:p>
       <w:pPr>
         <w:sectPr>
-          <w:headerReference w:type="default" r:id="rId15"/>
-          <w:footerReference w:type="default" r:id="rId16"/>
+          <w:headerReference w:type="default" r:id="rId19"/>
+          <w:footerReference w:type="default" r:id="rId20"/>
           <w:pgSz w:w="16838" w:h="11906" w:orient="landscape"/>
           <w:pgMar w:top="1531" w:right="1276" w:bottom="1531" w:left="1134" w:header="425" w:footer="289" w:gutter="0"/>
           <w:cols w:space="708"/>
@@ -3239,8 +3194,8 @@
           <w:szCs w:val="21"/>
         </w:rPr>
       </w:pPr>
-      <w:bookmarkStart w:id="1" w:name="_Hlk125895931"/>
-      <w:bookmarkStart w:id="2" w:name="_Hlk125895909"/>
+      <w:bookmarkStart w:id="0" w:name="_Hlk125895931"/>
+      <w:bookmarkStart w:id="1" w:name="_Hlk125895909"/>
       <w:r>
         <w:rPr>
           <w:sz w:val="19"/>
@@ -3324,8 +3279,8 @@
           <w:szCs w:val="21"/>
         </w:rPr>
       </w:pPr>
-      <w:bookmarkStart w:id="3" w:name="_Hlk125895940"/>
-      <w:bookmarkEnd w:id="1"/>
+      <w:bookmarkStart w:id="2" w:name="_Hlk125895940"/>
+      <w:bookmarkEnd w:id="0"/>
       <w:r>
         <w:rPr>
           <w:sz w:val="19"/>
@@ -3403,7 +3358,7 @@
         </w:rPr>
         <w:t>n</w:t>
       </w:r>
-      <w:bookmarkEnd w:id="2"/>
+      <w:bookmarkEnd w:id="1"/>
       <w:r>
         <w:rPr>
           <w:sz w:val="19"/>
@@ -3433,7 +3388,7 @@
             <w:cnfStyle w:val="001000000000" w:firstRow="0" w:lastRow="0" w:firstColumn="1" w:lastColumn="0" w:oddVBand="0" w:evenVBand="0" w:oddHBand="0" w:evenHBand="0" w:firstRowFirstColumn="0" w:firstRowLastColumn="0" w:lastRowFirstColumn="0" w:lastRowLastColumn="0"/>
             <w:tcW w:w="4422" w:type="dxa"/>
           </w:tcPr>
-          <w:bookmarkEnd w:id="3"/>
+          <w:bookmarkEnd w:id="2"/>
           <w:p>
             <w:r>
               <w:t>Menschliche Intelligenz</w:t>
@@ -3537,7 +3492,7 @@
           <w:szCs w:val="21"/>
         </w:rPr>
       </w:pPr>
-      <w:bookmarkStart w:id="4" w:name="_Hlk125895972"/>
+      <w:bookmarkStart w:id="3" w:name="_Hlk125895972"/>
     </w:p>
     <w:p>
       <w:pPr>
@@ -3750,7 +3705,7 @@
         </w:rPr>
         <w:t>.</w:t>
       </w:r>
-      <w:bookmarkEnd w:id="4"/>
+      <w:bookmarkEnd w:id="3"/>
     </w:p>
     <w:p>
       <w:pPr>
@@ -3764,7 +3719,7 @@
           <w:szCs w:val="21"/>
         </w:rPr>
       </w:pPr>
-      <w:bookmarkStart w:id="5" w:name="_Hlk125896148"/>
+      <w:bookmarkStart w:id="4" w:name="_Hlk125896148"/>
       <w:r>
         <w:rPr>
           <w:sz w:val="19"/>
@@ -3834,8 +3789,8 @@
           <w:szCs w:val="21"/>
         </w:rPr>
       </w:pPr>
-      <w:bookmarkStart w:id="6" w:name="_Hlk125896169"/>
-      <w:bookmarkEnd w:id="5"/>
+      <w:bookmarkStart w:id="5" w:name="_Hlk125896169"/>
+      <w:bookmarkEnd w:id="4"/>
       <w:r>
         <w:rPr>
           <w:sz w:val="19"/>
@@ -3921,7 +3876,7 @@
         <w:t xml:space="preserve">. </w:t>
       </w:r>
     </w:p>
-    <w:bookmarkEnd w:id="6"/>
+    <w:bookmarkEnd w:id="5"/>
     <w:p>
       <w:pPr>
         <w:pStyle w:val="Listenabsatz"/>
@@ -3972,71 +3927,7 @@
           <w:sz w:val="19"/>
           <w:szCs w:val="21"/>
         </w:rPr>
-        <w:t>„Künstliche Intelligenz“ ist die deutsche Übersetzung des Begriffs „</w:t>
-      </w:r>
-      <w:proofErr w:type="spellStart"/>
-      <w:r>
-        <w:rPr>
-          <w:sz w:val="19"/>
-          <w:szCs w:val="21"/>
-        </w:rPr>
-        <w:t>Artificial</w:t>
-      </w:r>
-      <w:proofErr w:type="spellEnd"/>
-      <w:r>
-        <w:rPr>
-          <w:sz w:val="19"/>
-          <w:szCs w:val="21"/>
-        </w:rPr>
-        <w:t xml:space="preserve"> </w:t>
-      </w:r>
-      <w:proofErr w:type="spellStart"/>
-      <w:r>
-        <w:rPr>
-          <w:sz w:val="19"/>
-          <w:szCs w:val="21"/>
-        </w:rPr>
-        <w:t>Intelligence</w:t>
-      </w:r>
-      <w:proofErr w:type="spellEnd"/>
-      <w:r>
-        <w:rPr>
-          <w:sz w:val="19"/>
-          <w:szCs w:val="21"/>
-        </w:rPr>
-        <w:t xml:space="preserve">“ (AI). Worauf geht der Begriff </w:t>
-      </w:r>
-      <w:proofErr w:type="spellStart"/>
-      <w:r>
-        <w:rPr>
-          <w:sz w:val="19"/>
-          <w:szCs w:val="21"/>
-        </w:rPr>
-        <w:t>Artificial</w:t>
-      </w:r>
-      <w:proofErr w:type="spellEnd"/>
-      <w:r>
-        <w:rPr>
-          <w:sz w:val="19"/>
-          <w:szCs w:val="21"/>
-        </w:rPr>
-        <w:t xml:space="preserve"> </w:t>
-      </w:r>
-      <w:proofErr w:type="spellStart"/>
-      <w:r>
-        <w:rPr>
-          <w:sz w:val="19"/>
-          <w:szCs w:val="21"/>
-        </w:rPr>
-        <w:t>Intelligence</w:t>
-      </w:r>
-      <w:proofErr w:type="spellEnd"/>
-      <w:r>
-        <w:rPr>
-          <w:sz w:val="19"/>
-          <w:szCs w:val="21"/>
-        </w:rPr>
-        <w:t xml:space="preserve"> zurück? </w:t>
+        <w:t xml:space="preserve">„Künstliche Intelligenz“ ist die deutsche Übersetzung des Begriffs „Artificial Intelligence“ (AI). Worauf geht der Begriff Artificial Intelligence zurück? </w:t>
       </w:r>
       <w:r>
         <w:rPr>
@@ -4360,8 +4251,8 @@
       </w:r>
     </w:p>
     <w:sectPr>
-      <w:headerReference w:type="default" r:id="rId17"/>
-      <w:footerReference w:type="default" r:id="rId18"/>
+      <w:headerReference w:type="default" r:id="rId21"/>
+      <w:footerReference w:type="default" r:id="rId22"/>
       <w:pgSz w:w="11906" w:h="16838"/>
       <w:pgMar w:top="1134" w:right="1274" w:bottom="1276" w:left="1531" w:header="425" w:footer="284" w:gutter="0"/>
       <w:cols w:space="708"/>
@@ -4391,6 +4282,16 @@
 </file>
 
 <file path=word/footer1.xml><?xml version="1.0" encoding="utf-8"?>
+<w:ftr xmlns:wpc="http://schemas.microsoft.com/office/word/2010/wordprocessingCanvas" xmlns:cx="http://schemas.microsoft.com/office/drawing/2014/chartex" xmlns:cx1="http://schemas.microsoft.com/office/drawing/2015/9/8/chartex" xmlns:cx2="http://schemas.microsoft.com/office/drawing/2015/10/21/chartex" xmlns:cx3="http://schemas.microsoft.com/office/drawing/2016/5/9/chartex" xmlns:cx4="http://schemas.microsoft.com/office/drawing/2016/5/10/chartex" xmlns:cx5="http://schemas.microsoft.com/office/drawing/2016/5/11/chartex" xmlns:cx6="http://schemas.microsoft.com/office/drawing/2016/5/12/chartex" xmlns:cx7="http://schemas.microsoft.com/office/drawing/2016/5/13/chartex" xmlns:cx8="http://schemas.microsoft.com/office/drawing/2016/5/14/chartex" xmlns:mc="http://schemas.openxmlformats.org/markup-compatibility/2006" xmlns:aink="http://schemas.microsoft.com/office/drawing/2016/ink" xmlns:am3d="http://schemas.microsoft.com/office/drawing/2017/model3d" xmlns:o="urn:schemas-microsoft-com:office:office" xmlns:oel="http://schemas.microsoft.com/office/2019/extlst" xmlns:r="http://schemas.openxmlformats.org/officeDocument/2006/relationships" xmlns:m="http://schemas.openxmlformats.org/officeDocument/2006/math" xmlns:v="urn:schemas-microsoft-com:vml" xmlns:wp14="http://schemas.microsoft.com/office/word/2010/wordprocessingDrawing" xmlns:wp="http://schemas.openxmlformats.org/drawingml/2006/wordprocessingDrawing" xmlns:w10="urn:schemas-microsoft-com:office:word" xmlns:w="http://schemas.openxmlformats.org/wordprocessingml/2006/main" xmlns:w14="http://schemas.microsoft.com/office/word/2010/wordml" xmlns:w15="http://schemas.microsoft.com/office/word/2012/wordml" xmlns:w16cex="http://schemas.microsoft.com/office/word/2018/wordml/cex" xmlns:w16cid="http://schemas.microsoft.com/office/word/2016/wordml/cid" xmlns:w16="http://schemas.microsoft.com/office/word/2018/wordml" xmlns:w16du="http://schemas.microsoft.com/office/word/2023/wordml/word16du" xmlns:w16sdtdh="http://schemas.microsoft.com/office/word/2020/wordml/sdtdatahash" xmlns:w16se="http://schemas.microsoft.com/office/word/2015/wordml/symex" xmlns:wpg="http://schemas.microsoft.com/office/word/2010/wordprocessingGroup" xmlns:wpi="http://schemas.microsoft.com/office/word/2010/wordprocessingInk" xmlns:wne="http://schemas.microsoft.com/office/word/2006/wordml" xmlns:wps="http://schemas.microsoft.com/office/word/2010/wordprocessingShape" mc:Ignorable="w14 w15 w16se w16cid w16 w16cex w16sdtdh wp14">
+  <w:p>
+    <w:pPr>
+      <w:pStyle w:val="Fuzeile"/>
+    </w:pPr>
+  </w:p>
+</w:ftr>
+</file>
+
+<file path=word/footer2.xml><?xml version="1.0" encoding="utf-8"?>
 <w:ftr xmlns:wpc="http://schemas.microsoft.com/office/word/2010/wordprocessingCanvas" xmlns:cx="http://schemas.microsoft.com/office/drawing/2014/chartex" xmlns:cx1="http://schemas.microsoft.com/office/drawing/2015/9/8/chartex" xmlns:cx2="http://schemas.microsoft.com/office/drawing/2015/10/21/chartex" xmlns:cx3="http://schemas.microsoft.com/office/drawing/2016/5/9/chartex" xmlns:cx4="http://schemas.microsoft.com/office/drawing/2016/5/10/chartex" xmlns:cx5="http://schemas.microsoft.com/office/drawing/2016/5/11/chartex" xmlns:cx6="http://schemas.microsoft.com/office/drawing/2016/5/12/chartex" xmlns:cx7="http://schemas.microsoft.com/office/drawing/2016/5/13/chartex" xmlns:cx8="http://schemas.microsoft.com/office/drawing/2016/5/14/chartex" xmlns:mc="http://schemas.openxmlformats.org/markup-compatibility/2006" xmlns:aink="http://schemas.microsoft.com/office/drawing/2016/ink" xmlns:am3d="http://schemas.microsoft.com/office/drawing/2017/model3d" xmlns:o="urn:schemas-microsoft-com:office:office" xmlns:oel="http://schemas.microsoft.com/office/2019/extlst" xmlns:r="http://schemas.openxmlformats.org/officeDocument/2006/relationships" xmlns:m="http://schemas.openxmlformats.org/officeDocument/2006/math" xmlns:v="urn:schemas-microsoft-com:vml" xmlns:wp14="http://schemas.microsoft.com/office/word/2010/wordprocessingDrawing" xmlns:wp="http://schemas.openxmlformats.org/drawingml/2006/wordprocessingDrawing" xmlns:w10="urn:schemas-microsoft-com:office:word" xmlns:w="http://schemas.openxmlformats.org/wordprocessingml/2006/main" xmlns:w14="http://schemas.microsoft.com/office/word/2010/wordml" xmlns:w15="http://schemas.microsoft.com/office/word/2012/wordml" xmlns:w16cex="http://schemas.microsoft.com/office/word/2018/wordml/cex" xmlns:w16cid="http://schemas.microsoft.com/office/word/2016/wordml/cid" xmlns:w16="http://schemas.microsoft.com/office/word/2018/wordml" xmlns:w16du="http://schemas.microsoft.com/office/word/2023/wordml/word16du" xmlns:w16sdtdh="http://schemas.microsoft.com/office/word/2020/wordml/sdtdatahash" xmlns:w16se="http://schemas.microsoft.com/office/word/2015/wordml/symex" xmlns:wpg="http://schemas.microsoft.com/office/word/2010/wordprocessingGroup" xmlns:wpi="http://schemas.microsoft.com/office/word/2010/wordprocessingInk" xmlns:wne="http://schemas.microsoft.com/office/word/2006/wordml" xmlns:wps="http://schemas.microsoft.com/office/word/2010/wordprocessingShape" mc:Ignorable="w14 w15 w16se w16cid w16 w16cex w16sdtdh wp14">
   <w:p>
     <w:pPr>
@@ -4765,7 +4666,7 @@
         <w:iCs/>
         <w:sz w:val="18"/>
       </w:rPr>
-      <w:t>06.01.22</w:t>
+      <w:t>12.06.23</w:t>
     </w:r>
     <w:r>
       <w:rPr>
@@ -4853,7 +4754,17 @@
 </w:ftr>
 </file>
 
-<file path=word/footer2.xml><?xml version="1.0" encoding="utf-8"?>
+<file path=word/footer3.xml><?xml version="1.0" encoding="utf-8"?>
+<w:ftr xmlns:wpc="http://schemas.microsoft.com/office/word/2010/wordprocessingCanvas" xmlns:cx="http://schemas.microsoft.com/office/drawing/2014/chartex" xmlns:cx1="http://schemas.microsoft.com/office/drawing/2015/9/8/chartex" xmlns:cx2="http://schemas.microsoft.com/office/drawing/2015/10/21/chartex" xmlns:cx3="http://schemas.microsoft.com/office/drawing/2016/5/9/chartex" xmlns:cx4="http://schemas.microsoft.com/office/drawing/2016/5/10/chartex" xmlns:cx5="http://schemas.microsoft.com/office/drawing/2016/5/11/chartex" xmlns:cx6="http://schemas.microsoft.com/office/drawing/2016/5/12/chartex" xmlns:cx7="http://schemas.microsoft.com/office/drawing/2016/5/13/chartex" xmlns:cx8="http://schemas.microsoft.com/office/drawing/2016/5/14/chartex" xmlns:mc="http://schemas.openxmlformats.org/markup-compatibility/2006" xmlns:aink="http://schemas.microsoft.com/office/drawing/2016/ink" xmlns:am3d="http://schemas.microsoft.com/office/drawing/2017/model3d" xmlns:o="urn:schemas-microsoft-com:office:office" xmlns:oel="http://schemas.microsoft.com/office/2019/extlst" xmlns:r="http://schemas.openxmlformats.org/officeDocument/2006/relationships" xmlns:m="http://schemas.openxmlformats.org/officeDocument/2006/math" xmlns:v="urn:schemas-microsoft-com:vml" xmlns:wp14="http://schemas.microsoft.com/office/word/2010/wordprocessingDrawing" xmlns:wp="http://schemas.openxmlformats.org/drawingml/2006/wordprocessingDrawing" xmlns:w10="urn:schemas-microsoft-com:office:word" xmlns:w="http://schemas.openxmlformats.org/wordprocessingml/2006/main" xmlns:w14="http://schemas.microsoft.com/office/word/2010/wordml" xmlns:w15="http://schemas.microsoft.com/office/word/2012/wordml" xmlns:w16cex="http://schemas.microsoft.com/office/word/2018/wordml/cex" xmlns:w16cid="http://schemas.microsoft.com/office/word/2016/wordml/cid" xmlns:w16="http://schemas.microsoft.com/office/word/2018/wordml" xmlns:w16du="http://schemas.microsoft.com/office/word/2023/wordml/word16du" xmlns:w16sdtdh="http://schemas.microsoft.com/office/word/2020/wordml/sdtdatahash" xmlns:w16se="http://schemas.microsoft.com/office/word/2015/wordml/symex" xmlns:wpg="http://schemas.microsoft.com/office/word/2010/wordprocessingGroup" xmlns:wpi="http://schemas.microsoft.com/office/word/2010/wordprocessingInk" xmlns:wne="http://schemas.microsoft.com/office/word/2006/wordml" xmlns:wps="http://schemas.microsoft.com/office/word/2010/wordprocessingShape" mc:Ignorable="w14 w15 w16se w16cid w16 w16cex w16sdtdh wp14">
+  <w:p>
+    <w:pPr>
+      <w:pStyle w:val="Fuzeile"/>
+    </w:pPr>
+  </w:p>
+</w:ftr>
+</file>
+
+<file path=word/footer4.xml><?xml version="1.0" encoding="utf-8"?>
 <w:ftr xmlns:wpc="http://schemas.microsoft.com/office/word/2010/wordprocessingCanvas" xmlns:cx="http://schemas.microsoft.com/office/drawing/2014/chartex" xmlns:cx1="http://schemas.microsoft.com/office/drawing/2015/9/8/chartex" xmlns:cx2="http://schemas.microsoft.com/office/drawing/2015/10/21/chartex" xmlns:cx3="http://schemas.microsoft.com/office/drawing/2016/5/9/chartex" xmlns:cx4="http://schemas.microsoft.com/office/drawing/2016/5/10/chartex" xmlns:cx5="http://schemas.microsoft.com/office/drawing/2016/5/11/chartex" xmlns:cx6="http://schemas.microsoft.com/office/drawing/2016/5/12/chartex" xmlns:cx7="http://schemas.microsoft.com/office/drawing/2016/5/13/chartex" xmlns:cx8="http://schemas.microsoft.com/office/drawing/2016/5/14/chartex" xmlns:mc="http://schemas.openxmlformats.org/markup-compatibility/2006" xmlns:aink="http://schemas.microsoft.com/office/drawing/2016/ink" xmlns:am3d="http://schemas.microsoft.com/office/drawing/2017/model3d" xmlns:o="urn:schemas-microsoft-com:office:office" xmlns:oel="http://schemas.microsoft.com/office/2019/extlst" xmlns:r="http://schemas.openxmlformats.org/officeDocument/2006/relationships" xmlns:m="http://schemas.openxmlformats.org/officeDocument/2006/math" xmlns:v="urn:schemas-microsoft-com:vml" xmlns:wp14="http://schemas.microsoft.com/office/word/2010/wordprocessingDrawing" xmlns:wp="http://schemas.openxmlformats.org/drawingml/2006/wordprocessingDrawing" xmlns:w10="urn:schemas-microsoft-com:office:word" xmlns:w="http://schemas.openxmlformats.org/wordprocessingml/2006/main" xmlns:w14="http://schemas.microsoft.com/office/word/2010/wordml" xmlns:w15="http://schemas.microsoft.com/office/word/2012/wordml" xmlns:w16cex="http://schemas.microsoft.com/office/word/2018/wordml/cex" xmlns:w16cid="http://schemas.microsoft.com/office/word/2016/wordml/cid" xmlns:w16="http://schemas.microsoft.com/office/word/2018/wordml" xmlns:w16du="http://schemas.microsoft.com/office/word/2023/wordml/word16du" xmlns:w16sdtdh="http://schemas.microsoft.com/office/word/2020/wordml/sdtdatahash" xmlns:w16se="http://schemas.microsoft.com/office/word/2015/wordml/symex" xmlns:wpg="http://schemas.microsoft.com/office/word/2010/wordprocessingGroup" xmlns:wpi="http://schemas.microsoft.com/office/word/2010/wordprocessingInk" xmlns:wne="http://schemas.microsoft.com/office/word/2006/wordml" xmlns:wps="http://schemas.microsoft.com/office/word/2010/wordprocessingShape" mc:Ignorable="w14 w15 w16se w16cid w16 w16cex w16sdtdh wp14">
   <w:p>
     <w:pPr>
@@ -5061,7 +4972,7 @@
 </w:ftr>
 </file>
 
-<file path=word/footer3.xml><?xml version="1.0" encoding="utf-8"?>
+<file path=word/footer5.xml><?xml version="1.0" encoding="utf-8"?>
 <w:ftr xmlns:wpc="http://schemas.microsoft.com/office/word/2010/wordprocessingCanvas" xmlns:cx="http://schemas.microsoft.com/office/drawing/2014/chartex" xmlns:cx1="http://schemas.microsoft.com/office/drawing/2015/9/8/chartex" xmlns:cx2="http://schemas.microsoft.com/office/drawing/2015/10/21/chartex" xmlns:cx3="http://schemas.microsoft.com/office/drawing/2016/5/9/chartex" xmlns:cx4="http://schemas.microsoft.com/office/drawing/2016/5/10/chartex" xmlns:cx5="http://schemas.microsoft.com/office/drawing/2016/5/11/chartex" xmlns:cx6="http://schemas.microsoft.com/office/drawing/2016/5/12/chartex" xmlns:cx7="http://schemas.microsoft.com/office/drawing/2016/5/13/chartex" xmlns:cx8="http://schemas.microsoft.com/office/drawing/2016/5/14/chartex" xmlns:mc="http://schemas.openxmlformats.org/markup-compatibility/2006" xmlns:aink="http://schemas.microsoft.com/office/drawing/2016/ink" xmlns:am3d="http://schemas.microsoft.com/office/drawing/2017/model3d" xmlns:o="urn:schemas-microsoft-com:office:office" xmlns:oel="http://schemas.microsoft.com/office/2019/extlst" xmlns:r="http://schemas.openxmlformats.org/officeDocument/2006/relationships" xmlns:m="http://schemas.openxmlformats.org/officeDocument/2006/math" xmlns:v="urn:schemas-microsoft-com:vml" xmlns:wp14="http://schemas.microsoft.com/office/word/2010/wordprocessingDrawing" xmlns:wp="http://schemas.openxmlformats.org/drawingml/2006/wordprocessingDrawing" xmlns:w10="urn:schemas-microsoft-com:office:word" xmlns:w="http://schemas.openxmlformats.org/wordprocessingml/2006/main" xmlns:w14="http://schemas.microsoft.com/office/word/2010/wordml" xmlns:w15="http://schemas.microsoft.com/office/word/2012/wordml" xmlns:w16cex="http://schemas.microsoft.com/office/word/2018/wordml/cex" xmlns:w16cid="http://schemas.microsoft.com/office/word/2016/wordml/cid" xmlns:w16="http://schemas.microsoft.com/office/word/2018/wordml" xmlns:w16du="http://schemas.microsoft.com/office/word/2023/wordml/word16du" xmlns:w16sdtdh="http://schemas.microsoft.com/office/word/2020/wordml/sdtdatahash" xmlns:w16se="http://schemas.microsoft.com/office/word/2015/wordml/symex" xmlns:wpg="http://schemas.microsoft.com/office/word/2010/wordprocessingGroup" xmlns:wpi="http://schemas.microsoft.com/office/word/2010/wordprocessingInk" xmlns:wne="http://schemas.microsoft.com/office/word/2006/wordml" xmlns:wps="http://schemas.microsoft.com/office/word/2010/wordprocessingShape" mc:Ignorable="w14 w15 w16se w16cid w16 w16cex w16sdtdh wp14">
   <w:p>
     <w:pPr>
@@ -5514,6 +5425,16 @@
 </file>
 
 <file path=word/header1.xml><?xml version="1.0" encoding="utf-8"?>
+<w:hdr xmlns:wpc="http://schemas.microsoft.com/office/word/2010/wordprocessingCanvas" xmlns:cx="http://schemas.microsoft.com/office/drawing/2014/chartex" xmlns:cx1="http://schemas.microsoft.com/office/drawing/2015/9/8/chartex" xmlns:cx2="http://schemas.microsoft.com/office/drawing/2015/10/21/chartex" xmlns:cx3="http://schemas.microsoft.com/office/drawing/2016/5/9/chartex" xmlns:cx4="http://schemas.microsoft.com/office/drawing/2016/5/10/chartex" xmlns:cx5="http://schemas.microsoft.com/office/drawing/2016/5/11/chartex" xmlns:cx6="http://schemas.microsoft.com/office/drawing/2016/5/12/chartex" xmlns:cx7="http://schemas.microsoft.com/office/drawing/2016/5/13/chartex" xmlns:cx8="http://schemas.microsoft.com/office/drawing/2016/5/14/chartex" xmlns:mc="http://schemas.openxmlformats.org/markup-compatibility/2006" xmlns:aink="http://schemas.microsoft.com/office/drawing/2016/ink" xmlns:am3d="http://schemas.microsoft.com/office/drawing/2017/model3d" xmlns:o="urn:schemas-microsoft-com:office:office" xmlns:oel="http://schemas.microsoft.com/office/2019/extlst" xmlns:r="http://schemas.openxmlformats.org/officeDocument/2006/relationships" xmlns:m="http://schemas.openxmlformats.org/officeDocument/2006/math" xmlns:v="urn:schemas-microsoft-com:vml" xmlns:wp14="http://schemas.microsoft.com/office/word/2010/wordprocessingDrawing" xmlns:wp="http://schemas.openxmlformats.org/drawingml/2006/wordprocessingDrawing" xmlns:w10="urn:schemas-microsoft-com:office:word" xmlns:w="http://schemas.openxmlformats.org/wordprocessingml/2006/main" xmlns:w14="http://schemas.microsoft.com/office/word/2010/wordml" xmlns:w15="http://schemas.microsoft.com/office/word/2012/wordml" xmlns:w16cex="http://schemas.microsoft.com/office/word/2018/wordml/cex" xmlns:w16cid="http://schemas.microsoft.com/office/word/2016/wordml/cid" xmlns:w16="http://schemas.microsoft.com/office/word/2018/wordml" xmlns:w16du="http://schemas.microsoft.com/office/word/2023/wordml/word16du" xmlns:w16sdtdh="http://schemas.microsoft.com/office/word/2020/wordml/sdtdatahash" xmlns:w16se="http://schemas.microsoft.com/office/word/2015/wordml/symex" xmlns:wpg="http://schemas.microsoft.com/office/word/2010/wordprocessingGroup" xmlns:wpi="http://schemas.microsoft.com/office/word/2010/wordprocessingInk" xmlns:wne="http://schemas.microsoft.com/office/word/2006/wordml" xmlns:wps="http://schemas.microsoft.com/office/word/2010/wordprocessingShape" mc:Ignorable="w14 w15 w16se w16cid w16 w16cex w16sdtdh wp14">
+  <w:p>
+    <w:pPr>
+      <w:pStyle w:val="Kopfzeile"/>
+    </w:pPr>
+  </w:p>
+</w:hdr>
+</file>
+
+<file path=word/header2.xml><?xml version="1.0" encoding="utf-8"?>
 <w:hdr xmlns:wpc="http://schemas.microsoft.com/office/word/2010/wordprocessingCanvas" xmlns:cx="http://schemas.microsoft.com/office/drawing/2014/chartex" xmlns:cx1="http://schemas.microsoft.com/office/drawing/2015/9/8/chartex" xmlns:cx2="http://schemas.microsoft.com/office/drawing/2015/10/21/chartex" xmlns:cx3="http://schemas.microsoft.com/office/drawing/2016/5/9/chartex" xmlns:cx4="http://schemas.microsoft.com/office/drawing/2016/5/10/chartex" xmlns:cx5="http://schemas.microsoft.com/office/drawing/2016/5/11/chartex" xmlns:cx6="http://schemas.microsoft.com/office/drawing/2016/5/12/chartex" xmlns:cx7="http://schemas.microsoft.com/office/drawing/2016/5/13/chartex" xmlns:cx8="http://schemas.microsoft.com/office/drawing/2016/5/14/chartex" xmlns:mc="http://schemas.openxmlformats.org/markup-compatibility/2006" xmlns:aink="http://schemas.microsoft.com/office/drawing/2016/ink" xmlns:am3d="http://schemas.microsoft.com/office/drawing/2017/model3d" xmlns:o="urn:schemas-microsoft-com:office:office" xmlns:oel="http://schemas.microsoft.com/office/2019/extlst" xmlns:r="http://schemas.openxmlformats.org/officeDocument/2006/relationships" xmlns:m="http://schemas.openxmlformats.org/officeDocument/2006/math" xmlns:v="urn:schemas-microsoft-com:vml" xmlns:wp14="http://schemas.microsoft.com/office/word/2010/wordprocessingDrawing" xmlns:wp="http://schemas.openxmlformats.org/drawingml/2006/wordprocessingDrawing" xmlns:w10="urn:schemas-microsoft-com:office:word" xmlns:w="http://schemas.openxmlformats.org/wordprocessingml/2006/main" xmlns:w14="http://schemas.microsoft.com/office/word/2010/wordml" xmlns:w15="http://schemas.microsoft.com/office/word/2012/wordml" xmlns:w16cex="http://schemas.microsoft.com/office/word/2018/wordml/cex" xmlns:w16cid="http://schemas.microsoft.com/office/word/2016/wordml/cid" xmlns:w16="http://schemas.microsoft.com/office/word/2018/wordml" xmlns:w16du="http://schemas.microsoft.com/office/word/2023/wordml/word16du" xmlns:w16sdtdh="http://schemas.microsoft.com/office/word/2020/wordml/sdtdatahash" xmlns:w16se="http://schemas.microsoft.com/office/word/2015/wordml/symex" xmlns:wpg="http://schemas.microsoft.com/office/word/2010/wordprocessingGroup" xmlns:wpi="http://schemas.microsoft.com/office/word/2010/wordprocessingInk" xmlns:wne="http://schemas.microsoft.com/office/word/2006/wordml" xmlns:wps="http://schemas.microsoft.com/office/word/2010/wordprocessingShape" mc:Ignorable="w14 w15 w16se w16cid w16 w16cex w16sdtdh wp14">
   <w:p>
     <w:pPr>
@@ -6048,7 +5969,17 @@
 </w:hdr>
 </file>
 
-<file path=word/header2.xml><?xml version="1.0" encoding="utf-8"?>
+<file path=word/header3.xml><?xml version="1.0" encoding="utf-8"?>
+<w:hdr xmlns:wpc="http://schemas.microsoft.com/office/word/2010/wordprocessingCanvas" xmlns:cx="http://schemas.microsoft.com/office/drawing/2014/chartex" xmlns:cx1="http://schemas.microsoft.com/office/drawing/2015/9/8/chartex" xmlns:cx2="http://schemas.microsoft.com/office/drawing/2015/10/21/chartex" xmlns:cx3="http://schemas.microsoft.com/office/drawing/2016/5/9/chartex" xmlns:cx4="http://schemas.microsoft.com/office/drawing/2016/5/10/chartex" xmlns:cx5="http://schemas.microsoft.com/office/drawing/2016/5/11/chartex" xmlns:cx6="http://schemas.microsoft.com/office/drawing/2016/5/12/chartex" xmlns:cx7="http://schemas.microsoft.com/office/drawing/2016/5/13/chartex" xmlns:cx8="http://schemas.microsoft.com/office/drawing/2016/5/14/chartex" xmlns:mc="http://schemas.openxmlformats.org/markup-compatibility/2006" xmlns:aink="http://schemas.microsoft.com/office/drawing/2016/ink" xmlns:am3d="http://schemas.microsoft.com/office/drawing/2017/model3d" xmlns:o="urn:schemas-microsoft-com:office:office" xmlns:oel="http://schemas.microsoft.com/office/2019/extlst" xmlns:r="http://schemas.openxmlformats.org/officeDocument/2006/relationships" xmlns:m="http://schemas.openxmlformats.org/officeDocument/2006/math" xmlns:v="urn:schemas-microsoft-com:vml" xmlns:wp14="http://schemas.microsoft.com/office/word/2010/wordprocessingDrawing" xmlns:wp="http://schemas.openxmlformats.org/drawingml/2006/wordprocessingDrawing" xmlns:w10="urn:schemas-microsoft-com:office:word" xmlns:w="http://schemas.openxmlformats.org/wordprocessingml/2006/main" xmlns:w14="http://schemas.microsoft.com/office/word/2010/wordml" xmlns:w15="http://schemas.microsoft.com/office/word/2012/wordml" xmlns:w16cex="http://schemas.microsoft.com/office/word/2018/wordml/cex" xmlns:w16cid="http://schemas.microsoft.com/office/word/2016/wordml/cid" xmlns:w16="http://schemas.microsoft.com/office/word/2018/wordml" xmlns:w16du="http://schemas.microsoft.com/office/word/2023/wordml/word16du" xmlns:w16sdtdh="http://schemas.microsoft.com/office/word/2020/wordml/sdtdatahash" xmlns:w16se="http://schemas.microsoft.com/office/word/2015/wordml/symex" xmlns:wpg="http://schemas.microsoft.com/office/word/2010/wordprocessingGroup" xmlns:wpi="http://schemas.microsoft.com/office/word/2010/wordprocessingInk" xmlns:wne="http://schemas.microsoft.com/office/word/2006/wordml" xmlns:wps="http://schemas.microsoft.com/office/word/2010/wordprocessingShape" mc:Ignorable="w14 w15 w16se w16cid w16 w16cex w16sdtdh wp14">
+  <w:p>
+    <w:pPr>
+      <w:pStyle w:val="Kopfzeile"/>
+    </w:pPr>
+  </w:p>
+</w:hdr>
+</file>
+
+<file path=word/header4.xml><?xml version="1.0" encoding="utf-8"?>
 <w:hdr xmlns:wpc="http://schemas.microsoft.com/office/word/2010/wordprocessingCanvas" xmlns:cx="http://schemas.microsoft.com/office/drawing/2014/chartex" xmlns:cx1="http://schemas.microsoft.com/office/drawing/2015/9/8/chartex" xmlns:cx2="http://schemas.microsoft.com/office/drawing/2015/10/21/chartex" xmlns:cx3="http://schemas.microsoft.com/office/drawing/2016/5/9/chartex" xmlns:cx4="http://schemas.microsoft.com/office/drawing/2016/5/10/chartex" xmlns:cx5="http://schemas.microsoft.com/office/drawing/2016/5/11/chartex" xmlns:cx6="http://schemas.microsoft.com/office/drawing/2016/5/12/chartex" xmlns:cx7="http://schemas.microsoft.com/office/drawing/2016/5/13/chartex" xmlns:cx8="http://schemas.microsoft.com/office/drawing/2016/5/14/chartex" xmlns:mc="http://schemas.openxmlformats.org/markup-compatibility/2006" xmlns:aink="http://schemas.microsoft.com/office/drawing/2016/ink" xmlns:am3d="http://schemas.microsoft.com/office/drawing/2017/model3d" xmlns:o="urn:schemas-microsoft-com:office:office" xmlns:oel="http://schemas.microsoft.com/office/2019/extlst" xmlns:r="http://schemas.openxmlformats.org/officeDocument/2006/relationships" xmlns:m="http://schemas.openxmlformats.org/officeDocument/2006/math" xmlns:v="urn:schemas-microsoft-com:vml" xmlns:wp14="http://schemas.microsoft.com/office/word/2010/wordprocessingDrawing" xmlns:wp="http://schemas.openxmlformats.org/drawingml/2006/wordprocessingDrawing" xmlns:w10="urn:schemas-microsoft-com:office:word" xmlns:w="http://schemas.openxmlformats.org/wordprocessingml/2006/main" xmlns:w14="http://schemas.microsoft.com/office/word/2010/wordml" xmlns:w15="http://schemas.microsoft.com/office/word/2012/wordml" xmlns:w16cex="http://schemas.microsoft.com/office/word/2018/wordml/cex" xmlns:w16cid="http://schemas.microsoft.com/office/word/2016/wordml/cid" xmlns:w16="http://schemas.microsoft.com/office/word/2018/wordml" xmlns:w16du="http://schemas.microsoft.com/office/word/2023/wordml/word16du" xmlns:w16sdtdh="http://schemas.microsoft.com/office/word/2020/wordml/sdtdatahash" xmlns:w16se="http://schemas.microsoft.com/office/word/2015/wordml/symex" xmlns:wpg="http://schemas.microsoft.com/office/word/2010/wordprocessingGroup" xmlns:wpi="http://schemas.microsoft.com/office/word/2010/wordprocessingInk" xmlns:wne="http://schemas.microsoft.com/office/word/2006/wordml" xmlns:wps="http://schemas.microsoft.com/office/word/2010/wordprocessingShape" mc:Ignorable="w14 w15 w16se w16cid w16 w16cex w16sdtdh wp14">
   <w:p>
     <w:pPr>
@@ -6561,7 +6492,7 @@
 </w:hdr>
 </file>
 
-<file path=word/header3.xml><?xml version="1.0" encoding="utf-8"?>
+<file path=word/header5.xml><?xml version="1.0" encoding="utf-8"?>
 <w:hdr xmlns:wpc="http://schemas.microsoft.com/office/word/2010/wordprocessingCanvas" xmlns:cx="http://schemas.microsoft.com/office/drawing/2014/chartex" xmlns:cx1="http://schemas.microsoft.com/office/drawing/2015/9/8/chartex" xmlns:cx2="http://schemas.microsoft.com/office/drawing/2015/10/21/chartex" xmlns:cx3="http://schemas.microsoft.com/office/drawing/2016/5/9/chartex" xmlns:cx4="http://schemas.microsoft.com/office/drawing/2016/5/10/chartex" xmlns:cx5="http://schemas.microsoft.com/office/drawing/2016/5/11/chartex" xmlns:cx6="http://schemas.microsoft.com/office/drawing/2016/5/12/chartex" xmlns:cx7="http://schemas.microsoft.com/office/drawing/2016/5/13/chartex" xmlns:cx8="http://schemas.microsoft.com/office/drawing/2016/5/14/chartex" xmlns:mc="http://schemas.openxmlformats.org/markup-compatibility/2006" xmlns:aink="http://schemas.microsoft.com/office/drawing/2016/ink" xmlns:am3d="http://schemas.microsoft.com/office/drawing/2017/model3d" xmlns:o="urn:schemas-microsoft-com:office:office" xmlns:oel="http://schemas.microsoft.com/office/2019/extlst" xmlns:r="http://schemas.openxmlformats.org/officeDocument/2006/relationships" xmlns:m="http://schemas.openxmlformats.org/officeDocument/2006/math" xmlns:v="urn:schemas-microsoft-com:vml" xmlns:wp14="http://schemas.microsoft.com/office/word/2010/wordprocessingDrawing" xmlns:wp="http://schemas.openxmlformats.org/drawingml/2006/wordprocessingDrawing" xmlns:w10="urn:schemas-microsoft-com:office:word" xmlns:w="http://schemas.openxmlformats.org/wordprocessingml/2006/main" xmlns:w14="http://schemas.microsoft.com/office/word/2010/wordml" xmlns:w15="http://schemas.microsoft.com/office/word/2012/wordml" xmlns:w16cex="http://schemas.microsoft.com/office/word/2018/wordml/cex" xmlns:w16cid="http://schemas.microsoft.com/office/word/2016/wordml/cid" xmlns:w16="http://schemas.microsoft.com/office/word/2018/wordml" xmlns:w16du="http://schemas.microsoft.com/office/word/2023/wordml/word16du" xmlns:w16sdtdh="http://schemas.microsoft.com/office/word/2020/wordml/sdtdatahash" xmlns:w16se="http://schemas.microsoft.com/office/word/2015/wordml/symex" xmlns:wpg="http://schemas.microsoft.com/office/word/2010/wordprocessingGroup" xmlns:wpi="http://schemas.microsoft.com/office/word/2010/wordprocessingInk" xmlns:wne="http://schemas.microsoft.com/office/word/2006/wordml" xmlns:wps="http://schemas.microsoft.com/office/word/2010/wordprocessingShape" mc:Ignorable="w14 w15 w16se w16cid w16 w16cex w16sdtdh wp14">
   <w:p>
     <w:pPr>

</xml_diff>